<commit_message>
Make the app safe to host on Streamlit Community Cloud
- AI_AGENT_CLOUD=1 (or running under /mount/src) switches to hosted mode
- API key: owner's key from Streamlit secrets, or a visitor's own key kept
  only in their browser session (per-session ContextVar in llm.py); nothing
  is written to the shared .env
- Optional APP_PASSWORD gate
- Per-visitor workspaces (?ws=... in the URL) on the ephemeral disk, ZIP
  download of any review or manuscript project
- Journal catalogue read-only online; Finder buttons hidden
- .streamlit/secrets.toml.example, minimum versions in requirements.txt,
  deploy instructions in README and HOW TO USE

Co-Authored-By: Claude Opus 5.5 <noreply@anthropic.com>
</commit_message>
<xml_diff>
--- a/HOW TO USE.docx
+++ b/HOW TO USE.docx
@@ -934,6 +934,144 @@
         <w:t xml:space="preserve"> file: it contains your API key.</w:t>
       </w:r>
     </w:p>
+    <w:p>
+      <w:pPr>
+        <w:pStyle w:val="Heading2"/>
+      </w:pPr>
+      <w:r>
+        <w:rPr>
+          <w:b w:val="0"/>
+          <w:i w:val="0"/>
+        </w:rPr>
+        <w:t>Using the online version</w:t>
+      </w:r>
+    </w:p>
+    <w:p>
+      <w:r>
+        <w:rPr>
+          <w:b w:val="0"/>
+          <w:i w:val="0"/>
+        </w:rPr>
+        <w:t>The online app works the same way, with three differences:</w:t>
+      </w:r>
+    </w:p>
+    <w:p>
+      <w:pPr>
+        <w:pStyle w:val="ListBullet"/>
+      </w:pPr>
+      <w:r>
+        <w:rPr>
+          <w:b w:val="0"/>
+          <w:i w:val="0"/>
+        </w:rPr>
+        <w:t xml:space="preserve">If you are asked for a </w:t>
+      </w:r>
+      <w:r>
+        <w:rPr>
+          <w:b/>
+          <w:i w:val="0"/>
+        </w:rPr>
+        <w:t>password</w:t>
+      </w:r>
+      <w:r>
+        <w:rPr>
+          <w:b w:val="0"/>
+          <w:i w:val="0"/>
+        </w:rPr>
+        <w:t>, it is the one set by the app owner.</w:t>
+      </w:r>
+    </w:p>
+    <w:p>
+      <w:pPr>
+        <w:pStyle w:val="ListBullet"/>
+      </w:pPr>
+      <w:r>
+        <w:rPr>
+          <w:b w:val="0"/>
+          <w:i w:val="0"/>
+        </w:rPr>
+        <w:t xml:space="preserve">If the sidebar says </w:t>
+      </w:r>
+      <w:r>
+        <w:rPr>
+          <w:b/>
+          <w:i w:val="0"/>
+        </w:rPr>
+        <w:t>API key: ❌</w:t>
+      </w:r>
+      <w:r>
+        <w:rPr>
+          <w:b w:val="0"/>
+          <w:i w:val="0"/>
+        </w:rPr>
+        <w:t xml:space="preserve">, paste your own key in </w:t>
+      </w:r>
+      <w:r>
+        <w:rPr>
+          <w:b/>
+          <w:i w:val="0"/>
+        </w:rPr>
+        <w:t>⚙️ Settings</w:t>
+      </w:r>
+      <w:r>
+        <w:rPr>
+          <w:b w:val="0"/>
+          <w:i w:val="0"/>
+        </w:rPr>
+        <w:t>. It is used only while</w:t>
+      </w:r>
+    </w:p>
+    <w:p>
+      <w:r>
+        <w:rPr>
+          <w:b w:val="0"/>
+          <w:i w:val="0"/>
+        </w:rPr>
+        <w:t>this browser tab is open and is never saved.</w:t>
+      </w:r>
+    </w:p>
+    <w:p>
+      <w:pPr>
+        <w:pStyle w:val="ListBullet"/>
+      </w:pPr>
+      <w:r>
+        <w:rPr>
+          <w:b/>
+          <w:i w:val="0"/>
+        </w:rPr>
+        <w:t>Files online are temporary.</w:t>
+      </w:r>
+      <w:r>
+        <w:rPr>
+          <w:b w:val="0"/>
+          <w:i w:val="0"/>
+        </w:rPr>
+        <w:t xml:space="preserve"> Download each result as Word, or download a ZIP from </w:t>
+      </w:r>
+      <w:r>
+        <w:rPr>
+          <w:b/>
+          <w:i w:val="0"/>
+        </w:rPr>
+        <w:t>📁 My files</w:t>
+      </w:r>
+      <w:r>
+        <w:rPr>
+          <w:b w:val="0"/>
+          <w:i w:val="0"/>
+        </w:rPr>
+        <w:t>,</w:t>
+      </w:r>
+    </w:p>
+    <w:p>
+      <w:r>
+        <w:rPr>
+          <w:b w:val="0"/>
+          <w:i w:val="0"/>
+        </w:rPr>
+        <w:t>before you leave. Bookmark the page to come back to your workspace while the app is running.</w:t>
+      </w:r>
+    </w:p>
     <w:sectPr>
       <w:pgSz w:w="12240" w:h="15840"/>
       <w:pgMar w:top="1440" w:right="1800" w:bottom="1440" w:left="1800" w:header="720" w:footer="720" w:gutter="0"/>

</xml_diff>

<commit_message>
Add free online AI providers: Google Gemini and OpenRouter
- llm.py: provider switch (anthropic | gemini | openrouter) behind the same
  ask() / ask_structured() functions; Claude path unchanged
- Free providers use their OpenAI-compatible APIs; structured output asks for
  JSON (json_schema -> json_object -> prompt-only fallback, remembered per
  model), validates it with the same Pydantic models, and asks once to repair
- Settings: choose provider, paste its key, load available models; online the
  choice and key stay in the browser session only
- Plain-language errors for invalid keys and free-tier limits
- .env / secrets templates, README and HOW TO USE updated

Co-Authored-By: Claude Opus 5.5 <noreply@anthropic.com>
</commit_message>
<xml_diff>
--- a/HOW TO USE.docx
+++ b/HOW TO USE.docx
@@ -140,7 +140,7 @@
           <w:b w:val="0"/>
           <w:i w:val="0"/>
         </w:rPr>
-        <w:t>One-time setting: your API key</w:t>
+        <w:t>One-time setting: choose the AI and paste its key</w:t>
       </w:r>
     </w:p>
     <w:p>
@@ -166,7 +166,110 @@
           <w:b w:val="0"/>
           <w:i w:val="0"/>
         </w:rPr>
-        <w:t xml:space="preserve"> in the left sidebar.</w:t>
+        <w:t xml:space="preserve"> in the left sidebar and choose the </w:t>
+      </w:r>
+      <w:r>
+        <w:rPr>
+          <w:b/>
+          <w:i w:val="0"/>
+        </w:rPr>
+        <w:t>AI provider</w:t>
+      </w:r>
+      <w:r>
+        <w:rPr>
+          <w:b w:val="0"/>
+          <w:i w:val="0"/>
+        </w:rPr>
+        <w:t>:</w:t>
+      </w:r>
+    </w:p>
+    <w:p>
+      <w:pPr>
+        <w:pStyle w:val="ListBullet2"/>
+      </w:pPr>
+      <w:r>
+        <w:rPr>
+          <w:b/>
+          <w:i w:val="0"/>
+        </w:rPr>
+        <w:t>Claude</w:t>
+      </w:r>
+      <w:r>
+        <w:rPr>
+          <w:b w:val="0"/>
+          <w:i w:val="0"/>
+        </w:rPr>
+        <w:t xml:space="preserve"> — paid (pay-as-you-go), best quality. Key from console.anthropic.com → API keys.</w:t>
+      </w:r>
+    </w:p>
+    <w:p>
+      <w:pPr>
+        <w:pStyle w:val="ListBullet2"/>
+      </w:pPr>
+      <w:r>
+        <w:rPr>
+          <w:b/>
+          <w:i w:val="0"/>
+        </w:rPr>
+        <w:t>Google Gemini — FREE.</w:t>
+      </w:r>
+      <w:r>
+        <w:rPr>
+          <w:b w:val="0"/>
+          <w:i w:val="0"/>
+        </w:rPr>
+        <w:t xml:space="preserve"> Key from aistudio.google.com/apikey (sign in with Google, no card).</w:t>
+      </w:r>
+    </w:p>
+    <w:p>
+      <w:r>
+        <w:rPr>
+          <w:b w:val="0"/>
+          <w:i w:val="0"/>
+        </w:rPr>
+        <w:t>On the free tier Google may use what you send, so do not use it for unpublished results or patient data.</w:t>
+      </w:r>
+    </w:p>
+    <w:p>
+      <w:pPr>
+        <w:pStyle w:val="ListBullet2"/>
+      </w:pPr>
+      <w:r>
+        <w:rPr>
+          <w:b/>
+          <w:i w:val="0"/>
+        </w:rPr>
+        <w:t>OpenRouter — FREE models.</w:t>
+      </w:r>
+      <w:r>
+        <w:rPr>
+          <w:b w:val="0"/>
+          <w:i w:val="0"/>
+        </w:rPr>
+        <w:t xml:space="preserve"> Key from openrouter.ai/keys; press </w:t>
+      </w:r>
+      <w:r>
+        <w:rPr>
+          <w:b/>
+          <w:i w:val="0"/>
+        </w:rPr>
+        <w:t>Load available models</w:t>
+      </w:r>
+      <w:r>
+        <w:rPr>
+          <w:b w:val="0"/>
+          <w:i w:val="0"/>
+        </w:rPr>
+        <w:t xml:space="preserve"> and pick one.</w:t>
+      </w:r>
+    </w:p>
+    <w:p>
+      <w:r>
+        <w:rPr>
+          <w:b w:val="0"/>
+          <w:i w:val="0"/>
+        </w:rPr>
+        <w:t>About 50 requests a day (roughly three full runs).</w:t>
       </w:r>
     </w:p>
     <w:p>
@@ -178,7 +281,7 @@
           <w:b w:val="0"/>
           <w:i w:val="0"/>
         </w:rPr>
-        <w:t xml:space="preserve">Paste your Anthropic API key (from console.anthropic.com → API keys) and press </w:t>
+        <w:t xml:space="preserve">Paste the key and press </w:t>
       </w:r>
       <w:r>
         <w:rPr>

</xml_diff>